<commit_message>
Main menu and load level state
050426 сделал меню черновое и переход на уровень
</commit_message>
<xml_diff>
--- a/ПОЛНАЯ РЕЖИССУРА/Концепт и идеии.docx
+++ b/ПОЛНАЯ РЕЖИССУРА/Концепт и идеии.docx
@@ -273,6 +273,35 @@
           <w:lang w:eastAsia="ru-RU"/>
         </w:rPr>
         <w:t>, темные тона).</w:t>
+      </w:r>
+      <w:r>
+        <w:rPr>
+          <w:rFonts w:ascii="Times New Roman" w:eastAsia="Times New Roman" w:hAnsi="Times New Roman" w:cs="Times New Roman"/>
+          <w:sz w:val="28"/>
+          <w:szCs w:val="28"/>
+          <w:lang w:eastAsia="ru-RU"/>
+        </w:rPr>
+        <w:t xml:space="preserve">   </w:t>
+      </w:r>
+      <w:bookmarkStart w:id="0" w:name="_GoBack"/>
+      <w:bookmarkEnd w:id="0"/>
+      <w:r>
+        <w:rPr>
+          <w:rFonts w:ascii="Times New Roman" w:eastAsia="Times New Roman" w:hAnsi="Times New Roman" w:cs="Times New Roman"/>
+          <w:sz w:val="28"/>
+          <w:szCs w:val="28"/>
+          <w:lang w:eastAsia="ru-RU"/>
+        </w:rPr>
+        <w:t>2</w:t>
+      </w:r>
+      <w:r>
+        <w:rPr>
+          <w:rFonts w:ascii="Times New Roman" w:eastAsia="Times New Roman" w:hAnsi="Times New Roman" w:cs="Times New Roman"/>
+          <w:sz w:val="28"/>
+          <w:szCs w:val="28"/>
+          <w:lang w:val="en-US" w:eastAsia="ru-RU"/>
+        </w:rPr>
+        <w:t>d</w:t>
       </w:r>
     </w:p>
     <w:p>
@@ -5130,7 +5159,6 @@
           <w:lang w:eastAsia="ru-RU"/>
         </w:rPr>
       </w:pPr>
-      <w:bookmarkStart w:id="0" w:name="_GoBack"/>
       <w:proofErr w:type="gramStart"/>
       <w:r>
         <w:rPr>
@@ -6061,7 +6089,6 @@
         <w:t>]</w:t>
       </w:r>
     </w:p>
-    <w:bookmarkEnd w:id="0"/>
     <w:p>
       <w:pPr>
         <w:rPr>
@@ -7943,7 +7970,7 @@
 </file>
 
 <file path=customXml/itemProps1.xml><?xml version="1.0" encoding="utf-8"?>
-<ds:datastoreItem xmlns:ds="http://schemas.openxmlformats.org/officeDocument/2006/customXml" ds:itemID="{0AC25817-BF9E-4CA7-B3C6-AE2675EEDB1F}">
+<ds:datastoreItem xmlns:ds="http://schemas.openxmlformats.org/officeDocument/2006/customXml" ds:itemID="{A586F27D-BBEA-46E2-B77C-538EE49F6D22}">
   <ds:schemaRefs>
     <ds:schemaRef ds:uri="http://schemas.openxmlformats.org/officeDocument/2006/bibliography"/>
   </ds:schemaRefs>

</xml_diff>